<commit_message>
Add Update Channel and Kill WiFi to production; install guide WiFi guidance
</commit_message>
<xml_diff>
--- a/docs/lynx_install_guide.docx
+++ b/docs/lynx_install_guide.docx
@@ -37,7 +37,7 @@
           <w:b/>
           <w:bCs/>
         </w:rPr>
-        <w:t xml:space="preserve">Version 1.5  —  G8YTZ / EI3IOB  —  July 2026</w:t>
+        <w:t xml:space="preserve">Version 1.7  —  G8YTZ / EI3IOB  —  August 2026</w:t>
       </w:r>
     </w:p>
     <w:p>
@@ -94,7 +94,7 @@
         <w:spacing w:after="80"/>
       </w:pPr>
       <w:r>
-        <w:t xml:space="preserve">A Picotuner (WinterHill firmware) on the same LAN as the Pi, with its IP address noted — a second Picotuner is optional, and only needed if you want diversity reception (Section 9)</w:t>
+        <w:t xml:space="preserve">A Picotuner (WinterHill firmware) on the same LAN as the Pi, with its IP address noted — a single unit, with two tuner circuits built in; the second one is only relevant if you want diversity reception (Section 8), and needs no separate device or IP address of its own</w:t>
       </w:r>
     </w:p>
     <w:p>
@@ -120,7 +120,7 @@
         <w:spacing w:after="80"/>
       </w:pPr>
       <w:r>
-        <w:t xml:space="preserve">Network access for the Pi — wired Ethernet strongly preferred over WiFi for reliability, though either works</w:t>
+        <w:t xml:space="preserve">Network access for the Pi — wired Ethernet strongly recommended. WiFi is discouraged for this receiver: this hardware's WiFi driver has a documented history of reliability issues, worse still with more than one saved network, and a roaming/reconnect event can silently move the Pi onto a different subnet, breaking the Picotuner and Knobler's local discovery. If Ethernet is available at all, use it</w:t>
       </w:r>
     </w:p>
     <w:p>
@@ -238,7 +238,7 @@
         <w:spacing w:after="80"/>
       </w:pPr>
       <w:r>
-        <w:t xml:space="preserve">Click the gear/settings icon to pre-configure: hostname, SSH (enable, password auth), username/password, WiFi if not using Ethernet, and locale/timezone.</w:t>
+        <w:t xml:space="preserve">Click the gear/settings icon to pre-configure: hostname, SSH (enable, password auth), username/password, WiFi if not using Ethernet, and locale/timezone. If configuring WiFi, also set the WiFi country here — leaving it blank can leave the radio non-functional with no obvious error to point at the cause (Section 11.10). WiFi is discouraged for this receiver if Ethernet is available (see “What You'll Need” above) — it can be disabled later from the Web Control Portal's Config page if it was set up here and later turns out not to be needed.</w:t>
       </w:r>
     </w:p>
     <w:p>
@@ -1687,15 +1687,15 @@
         <w:spacing w:after="150"/>
       </w:pPr>
       <w:r>
-        <w:t xml:space="preserve">A second Picotuner, tuned to the same frequency and symbol rate, can be combined with the first for improved resilience against short signal fades — particularly useful on tropospheric or other marginal paths, using cross-polarised antennas to catch fades one polarisation misses.</w:t>
-      </w:r>
-    </w:p>
-    <w:p>
-      <w:pPr>
-        <w:spacing w:after="150"/>
-      </w:pPr>
-      <w:r>
-        <w:t xml:space="preserve">To enable it: connect the second Picotuner to the same network, note its IP, and select “Diversity” from the plug selector (alongside the existing A/B options) — either in Manual Tune, or when saving a memory preset. This tunes both receivers together and starts the combiner as a managed background process.</w:t>
+        <w:t xml:space="preserve">A Picotuner's second, built-in tuner circuit, tuned to the same frequency and symbol rate as the first, can be combined with it for improved resilience against short signal fades — particularly useful on tropospheric or other marginal paths, using cross-polarised antennas to catch fades one polarisation misses.</w:t>
+      </w:r>
+    </w:p>
+    <w:p>
+      <w:pPr>
+        <w:spacing w:after="150"/>
+      </w:pPr>
+      <w:r>
+        <w:t xml:space="preserve">To enable it: connect a second antenna (typically cross-polarised relative to the first) to the Picotuner's second tuner input, and select “Diversity” from the plug selector (alongside the existing A/B options) — either in Manual Tune, or when saving a memory preset. This tunes both of the Picotuner's tuner circuits together and starts the combiner as a managed background process.</w:t>
       </w:r>
     </w:p>
     <w:p>
@@ -1722,7 +1722,7 @@
           <w:sz w:val="20"/>
           <w:szCs w:val="20"/>
         </w:rPr>
-        <w:t xml:space="preserve">Diversity mode is a genuinely separate, more complex code path from single-receiver operation. If you don't have a second Picotuner, none of this applies — normal A/B single-tuner operation is unaffected.</w:t>
+        <w:t xml:space="preserve">Diversity mode is a genuinely separate, more complex code path from single-receiver operation. If the Picotuner's second tuner circuit isn't connected to an antenna, none of this applies — normal A/B single-tuner operation is unaffected.</w:t>
       </w:r>
     </w:p>
     <w:p>
@@ -2441,6 +2441,73 @@
       </w:pPr>
       <w:r>
         <w:t xml:space="preserve">Lynx's own web app prints detailed startup and request logs directly to the terminal it's running in — visible in the terminal window on the Pi's own desktop if using the autostart method (Section 7). Scroll back through it for the specific error.</w:t>
+      </w:r>
+    </w:p>
+    <w:p>
+      <w:pPr>
+        <w:pStyle w:val="Heading2"/>
+        <w:spacing w:after="150" w:before="300"/>
+      </w:pPr>
+      <w:r>
+        <w:t xml:space="preserve">11.9 Reboot button (or Update Now) fails with a passwordless sudo error</w:t>
+      </w:r>
+    </w:p>
+    <w:p>
+      <w:pPr>
+        <w:spacing w:after="150"/>
+      </w:pPr>
+      <w:r>
+        <w:t xml:space="preserve">Both depend on the user Lynx runs as being able to run ‘sudo reboot’ without a password prompt - the default on standard Raspberry Pi OS, but worth confirming directly if either ever fails with this specific error. Fix (run on the Pi over SSH):</w:t>
+      </w:r>
+    </w:p>
+    <w:p>
+      <w:pPr>
+        <w:shd w:fill="F0F0F0" w:val="clear"/>
+        <w:spacing w:after="150" w:before="100"/>
+        <w:ind w:left="360"/>
+      </w:pPr>
+      <w:r>
+        <w:rPr>
+          <w:rFonts w:ascii="Consolas" w:cs="Consolas" w:eastAsia="Consolas" w:hAnsi="Consolas"/>
+          <w:sz w:val="20"/>
+          <w:szCs w:val="20"/>
+        </w:rPr>
+        <w:t xml:space="preserve">echo "$USER ALL=(ALL) NOPASSWD: /sbin/reboot, /usr/sbin/reboot" | sudo tee /etc/sudoers.d/lynx-reboot
+sudo chmod 0440 /etc/sudoers.d/lynx-reboot
+sudo visudo -c</w:t>
+      </w:r>
+    </w:p>
+    <w:p>
+      <w:pPr>
+        <w:spacing w:after="150"/>
+      </w:pPr>
+      <w:r>
+        <w:t xml:space="preserve">A dedicated file in /etc/sudoers.d/ rather than editing /etc/sudoers directly - easy to review or remove on its own, and ‘visudo -c’ validates the syntax of all sudoers files without needing an editor, catching a typo before it can lock sudo out entirely.</w:t>
+      </w:r>
+    </w:p>
+    <w:p>
+      <w:pPr>
+        <w:pStyle w:val="Heading2"/>
+        <w:spacing w:after="150" w:before="300"/>
+      </w:pPr>
+      <w:r>
+        <w:t xml:space="preserve">11.10 WiFi connects to nothing, or the radio seems unresponsive</w:t>
+      </w:r>
+    </w:p>
+    <w:p>
+      <w:pPr>
+        <w:spacing w:after="150"/>
+      </w:pPr>
+      <w:r>
+        <w:t xml:space="preserve">Check that a WiFi country is actually set: sudo raspi-config → Localisation Options → WLAN Country — or set it directly in Raspberry Pi Imager's own settings before flashing (Section 2). An unset country can leave the radio non-functional with no clear error pointing at the cause. Confirmed directly: a Pi with WiFi otherwise correctly configured (SSID and password both set) showed no visible networks at all until its country was set.</w:t>
+      </w:r>
+    </w:p>
+    <w:p>
+      <w:pPr>
+        <w:spacing w:after="150"/>
+      </w:pPr>
+      <w:r>
+        <w:t xml:space="preserve">WiFi is discouraged for this receiver if wired Ethernet is available at all (see “What You'll Need”, Section 1.1) — if Lynx is already running on Ethernet, the cleanest fix is usually to leave WiFi disabled entirely via the Web Control Portal's Config page (WiFi card, “Disable WiFi”) rather than debug it further.</w:t>
       </w:r>
     </w:p>
     <w:p>

</xml_diff>

<commit_message>
Updated manuals incorporating new features and clarifications
Updated manuals incorporating new features and clarifications
</commit_message>
<xml_diff>
--- a/docs/lynx_install_guide.docx
+++ b/docs/lynx_install_guide.docx
@@ -37,7 +37,7 @@
           <w:b/>
           <w:bCs/>
         </w:rPr>
-        <w:t xml:space="preserve">Version 1.7  —  G8YTZ / EI3IOB  —  August 2026</w:t>
+        <w:t xml:space="preserve">Version 1.8  —  G8YTZ / EI3IOB  —  August 2026</w:t>
       </w:r>
     </w:p>
     <w:p>
@@ -334,6 +334,14 @@
       </w:pPr>
       <w:r>
         <w:t xml:space="preserve">Accept the host key prompt on first connection, and enter the password you set in Imager.</w:t>
+      </w:r>
+    </w:p>
+    <w:p>
+      <w:pPr>
+        <w:spacing w:after="150"/>
+      </w:pPr>
+      <w:r>
+        <w:t xml:space="preserve">Always connect, and paste any commands, via a genuine SSH terminal (macOS/Linux Terminal, Windows Terminal, PuTTY) — not a VNC/remote-desktop session's own terminal window. Confirmed directly as a real cause of a broken install: pasting into a VNC session's terminal on a Pi set to a non-English locale/keyboard layout corrupted a special character inside config.yaml (a genuine encoding mismatch introduced by the VNC session itself), breaking Lynx on every subsequent start with a YAML parsing error. A direct SSH terminal session doesn't go through any of that clipboard/keyboard-layout translation, avoiding this entirely.</w:t>
       </w:r>
     </w:p>
     <w:p>

</xml_diff>

<commit_message>
Updated Beta install guide
Updated Beta install guide
</commit_message>
<xml_diff>
--- a/docs/lynx_install_guide.docx
+++ b/docs/lynx_install_guide.docx
@@ -37,7 +37,7 @@
           <w:b/>
           <w:bCs/>
         </w:rPr>
-        <w:t xml:space="preserve">Version 1.5  —  G8YTZ / EI3IOB  —  July 2026</w:t>
+        <w:t xml:space="preserve">Version 1.8  —  G8YTZ / EI3IOB  —  August 2026</w:t>
       </w:r>
     </w:p>
     <w:p>
@@ -94,7 +94,7 @@
         <w:spacing w:after="80"/>
       </w:pPr>
       <w:r>
-        <w:t xml:space="preserve">A Picotuner (WinterHill firmware) on the same LAN as the Pi, with its IP address noted — a second Picotuner is optional, and only needed if you want diversity reception (Section 9)</w:t>
+        <w:t xml:space="preserve">A Picotuner (WinterHill firmware) on the same LAN as the Pi, with its IP address noted — a single unit, with two tuner circuits built in; the second one is only relevant if you want diversity reception (Section 8), and needs no separate device or IP address of its own</w:t>
       </w:r>
     </w:p>
     <w:p>
@@ -120,7 +120,7 @@
         <w:spacing w:after="80"/>
       </w:pPr>
       <w:r>
-        <w:t xml:space="preserve">Network access for the Pi — wired Ethernet strongly preferred over WiFi for reliability, though either works</w:t>
+        <w:t xml:space="preserve">Network access for the Pi — wired Ethernet strongly recommended. WiFi is discouraged for this receiver: this hardware's WiFi driver has a documented history of reliability issues, worse still with more than one saved network, and a roaming/reconnect event can silently move the Pi onto a different subnet, breaking the Picotuner and Knobler's local discovery. If Ethernet is available at all, use it</w:t>
       </w:r>
     </w:p>
     <w:p>
@@ -238,7 +238,7 @@
         <w:spacing w:after="80"/>
       </w:pPr>
       <w:r>
-        <w:t xml:space="preserve">Click the gear/settings icon to pre-configure: hostname, SSH (enable, password auth), username/password, WiFi if not using Ethernet, and locale/timezone.</w:t>
+        <w:t xml:space="preserve">Click the gear/settings icon to pre-configure: hostname, SSH (enable, password auth), username/password, WiFi if not using Ethernet, and locale/timezone. If configuring WiFi, also set the WiFi country here — leaving it blank can leave the radio non-functional with no obvious error to point at the cause (Section 11.10). WiFi is discouraged for this receiver if Ethernet is available (see “What You'll Need” above) — it can be disabled later from the Web Control Portal's Config page if it was set up here and later turns out not to be needed.</w:t>
       </w:r>
     </w:p>
     <w:p>
@@ -338,6 +338,14 @@
     </w:p>
     <w:p>
       <w:pPr>
+        <w:spacing w:after="150"/>
+      </w:pPr>
+      <w:r>
+        <w:t xml:space="preserve">Always connect, and paste any commands, via a genuine SSH terminal (macOS/Linux Terminal, Windows Terminal, PuTTY) — not a VNC/remote-desktop session's own terminal window. Confirmed directly as a real cause of a broken install: pasting into a VNC session's terminal on a Pi set to a non-English locale/keyboard layout corrupted a special character inside config.yaml (a genuine encoding mismatch introduced by the VNC session itself), breaking Lynx on every subsequent start with a YAML parsing error. A direct SSH terminal session doesn't go through any of that clipboard/keyboard-layout translation, avoiding this entirely.</w:t>
+      </w:r>
+    </w:p>
+    <w:p>
+      <w:pPr>
         <w:pStyle w:val="Heading1"/>
         <w:spacing w:after="200" w:before="400"/>
       </w:pPr>
@@ -382,7 +390,7 @@
           <w:sz w:val="20"/>
           <w:szCs w:val="20"/>
         </w:rPr>
-        <w:t xml:space="preserve">curl -sSL https://raw.githubusercontent.com/G8YTZ/lynx-datv-receiver/main/install.sh | bash</w:t>
+        <w:t xml:space="preserve">curl -sSL https://raw.githubusercontent.com/G8YTZ/lynx-datv-receiver/beta/install.sh | bash</w:t>
       </w:r>
     </w:p>
     <w:p>
@@ -1299,7 +1307,7 @@
           <w:sz w:val="20"/>
           <w:szCs w:val="20"/>
         </w:rPr>
-        <w:t xml:space="preserve">git clone https://github.com/G8YTZ/lynx-datv-receiver.git ~/lynx</w:t>
+        <w:t xml:space="preserve">git clone -b beta https://github.com/G8YTZ/lynx-datv-receiver.git ~/lynx</w:t>
       </w:r>
     </w:p>
     <w:p>
@@ -1687,15 +1695,15 @@
         <w:spacing w:after="150"/>
       </w:pPr>
       <w:r>
-        <w:t xml:space="preserve">A second Picotuner, tuned to the same frequency and symbol rate, can be combined with the first for improved resilience against short signal fades — particularly useful on tropospheric or other marginal paths, using cross-polarised antennas to catch fades one polarisation misses.</w:t>
-      </w:r>
-    </w:p>
-    <w:p>
-      <w:pPr>
-        <w:spacing w:after="150"/>
-      </w:pPr>
-      <w:r>
-        <w:t xml:space="preserve">To enable it: connect the second Picotuner to the same network, note its IP, and select “Diversity” from the plug selector (alongside the existing A/B options) — either in Manual Tune, or when saving a memory preset. This tunes both receivers together and starts the combiner as a managed background process.</w:t>
+        <w:t xml:space="preserve">A Picotuner's second, built-in tuner circuit, tuned to the same frequency and symbol rate as the first, can be combined with it for improved resilience against short signal fades — particularly useful on tropospheric or other marginal paths, using cross-polarised antennas to catch fades one polarisation misses.</w:t>
+      </w:r>
+    </w:p>
+    <w:p>
+      <w:pPr>
+        <w:spacing w:after="150"/>
+      </w:pPr>
+      <w:r>
+        <w:t xml:space="preserve">To enable it: connect a second antenna (typically cross-polarised relative to the first) to the Picotuner's second tuner input, and select “Diversity” from the plug selector (alongside the existing A/B options) — either in Manual Tune, or when saving a memory preset. This tunes both of the Picotuner's tuner circuits together and starts the combiner as a managed background process.</w:t>
       </w:r>
     </w:p>
     <w:p>
@@ -1722,7 +1730,7 @@
           <w:sz w:val="20"/>
           <w:szCs w:val="20"/>
         </w:rPr>
-        <w:t xml:space="preserve">Diversity mode is a genuinely separate, more complex code path from single-receiver operation. If you don't have a second Picotuner, none of this applies — normal A/B single-tuner operation is unaffected.</w:t>
+        <w:t xml:space="preserve">Diversity mode is a genuinely separate, more complex code path from single-receiver operation. If the Picotuner's second tuner circuit isn't connected to an antenna, none of this applies — normal A/B single-tuner operation is unaffected.</w:t>
       </w:r>
     </w:p>
     <w:p>
@@ -2441,6 +2449,73 @@
       </w:pPr>
       <w:r>
         <w:t xml:space="preserve">Lynx's own web app prints detailed startup and request logs directly to the terminal it's running in — visible in the terminal window on the Pi's own desktop if using the autostart method (Section 7). Scroll back through it for the specific error.</w:t>
+      </w:r>
+    </w:p>
+    <w:p>
+      <w:pPr>
+        <w:pStyle w:val="Heading2"/>
+        <w:spacing w:after="150" w:before="300"/>
+      </w:pPr>
+      <w:r>
+        <w:t xml:space="preserve">11.9 Reboot button (or Update Now) fails with a passwordless sudo error</w:t>
+      </w:r>
+    </w:p>
+    <w:p>
+      <w:pPr>
+        <w:spacing w:after="150"/>
+      </w:pPr>
+      <w:r>
+        <w:t xml:space="preserve">Both depend on the user Lynx runs as being able to run ‘sudo reboot’ without a password prompt - the default on standard Raspberry Pi OS, but worth confirming directly if either ever fails with this specific error. Fix (run on the Pi over SSH):</w:t>
+      </w:r>
+    </w:p>
+    <w:p>
+      <w:pPr>
+        <w:shd w:fill="F0F0F0" w:val="clear"/>
+        <w:spacing w:after="150" w:before="100"/>
+        <w:ind w:left="360"/>
+      </w:pPr>
+      <w:r>
+        <w:rPr>
+          <w:rFonts w:ascii="Consolas" w:cs="Consolas" w:eastAsia="Consolas" w:hAnsi="Consolas"/>
+          <w:sz w:val="20"/>
+          <w:szCs w:val="20"/>
+        </w:rPr>
+        <w:t xml:space="preserve">echo "$USER ALL=(ALL) NOPASSWD: /sbin/reboot, /usr/sbin/reboot" | sudo tee /etc/sudoers.d/lynx-reboot
+sudo chmod 0440 /etc/sudoers.d/lynx-reboot
+sudo visudo -c</w:t>
+      </w:r>
+    </w:p>
+    <w:p>
+      <w:pPr>
+        <w:spacing w:after="150"/>
+      </w:pPr>
+      <w:r>
+        <w:t xml:space="preserve">A dedicated file in /etc/sudoers.d/ rather than editing /etc/sudoers directly - easy to review or remove on its own, and ‘visudo -c’ validates the syntax of all sudoers files without needing an editor, catching a typo before it can lock sudo out entirely.</w:t>
+      </w:r>
+    </w:p>
+    <w:p>
+      <w:pPr>
+        <w:pStyle w:val="Heading2"/>
+        <w:spacing w:after="150" w:before="300"/>
+      </w:pPr>
+      <w:r>
+        <w:t xml:space="preserve">11.10 WiFi connects to nothing, or the radio seems unresponsive</w:t>
+      </w:r>
+    </w:p>
+    <w:p>
+      <w:pPr>
+        <w:spacing w:after="150"/>
+      </w:pPr>
+      <w:r>
+        <w:t xml:space="preserve">Check that a WiFi country is actually set: sudo raspi-config → Localisation Options → WLAN Country — or set it directly in Raspberry Pi Imager's own settings before flashing (Section 2). An unset country can leave the radio non-functional with no clear error pointing at the cause. Confirmed directly: a Pi with WiFi otherwise correctly configured (SSID and password both set) showed no visible networks at all until its country was set.</w:t>
+      </w:r>
+    </w:p>
+    <w:p>
+      <w:pPr>
+        <w:spacing w:after="150"/>
+      </w:pPr>
+      <w:r>
+        <w:t xml:space="preserve">WiFi is discouraged for this receiver if wired Ethernet is available at all (see “What You'll Need”, Section 1.1) — if Lynx is already running on Ethernet, the cleanest fix is usually to leave WiFi disabled entirely via the Web Control Portal's Config page (WiFi card, “Disable WiFi”) rather than debug it further.</w:t>
       </w:r>
     </w:p>
     <w:p>

</xml_diff>

<commit_message>
Added NVMe migration Appendix
Added NVMe migration Appendix
</commit_message>
<xml_diff>
--- a/docs/lynx_install_guide.docx
+++ b/docs/lynx_install_guide.docx
@@ -2920,6 +2920,778 @@
         </w:tc>
       </w:tr>
     </w:tbl>
+    <w:p>
+      <w:r>
+        <w:br w:type="page"/>
+      </w:r>
+    </w:p>
+    <w:p>
+      <w:pPr>
+        <w:pStyle w:val="Heading1"/>
+        <w:spacing w:after="150" w:before="400"/>
+      </w:pPr>
+      <w:r>
+        <w:t xml:space="preserve">Appendix A. Moving from a microSD Card to NVMe</w:t>
+      </w:r>
+    </w:p>
+    <w:p>
+      <w:pPr>
+        <w:spacing w:after="150"/>
+      </w:pPr>
+      <w:r>
+        <w:t xml:space="preserve">SD cards are fine for getting started, but they wear out under continuous writing. A repeater receiver runs day and night, logging and updating as it goes, and sooner or later the card gives up — invariably on a wet Sunday, on a hilltop, in the dark. An NVMe drive will comfortably outlast the Pi.</w:t>
+      </w:r>
+    </w:p>
+    <w:p>
+      <w:pPr>
+        <w:spacing w:after="150"/>
+      </w:pPr>
+      <w:r>
+        <w:t xml:space="preserve">This appendix takes a working Lynx installation on a microSD card, as built in Sections 2 to 6, and moves it to an NVMe drive with all your settings intact. It takes about twenty minutes, most of which is the copy running unattended.</w:t>
+      </w:r>
+    </w:p>
+    <w:p>
+      <w:pPr>
+        <w:pBdr>
+          <w:left w:val="single" w:color="E8A33D" w:sz="12" w:space="8"/>
+        </w:pBdr>
+        <w:shd w:fill="FFF4E5" w:val="clear"/>
+        <w:spacing w:after="200" w:before="100"/>
+        <w:ind w:left="200"/>
+      </w:pPr>
+      <w:r>
+        <w:rPr>
+          <w:i/>
+          <w:iCs/>
+          <w:sz w:val="20"/>
+          <w:szCs w:val="20"/>
+        </w:rPr>
+        <w:t xml:space="preserve">Do this at the bench, with a monitor, keyboard and mouse attached — not over SSH at a remote site. You will need physical access to remove the SD card at the end.</w:t>
+      </w:r>
+    </w:p>
+    <w:p>
+      <w:pPr>
+        <w:pStyle w:val="Heading2"/>
+        <w:spacing w:after="150" w:before="300"/>
+      </w:pPr>
+      <w:r>
+        <w:t xml:space="preserve">A.1 What You’ll Need</w:t>
+      </w:r>
+    </w:p>
+    <w:p>
+      <w:pPr>
+        <w:pStyle w:val="ListParagraph"/>
+        <w:numPr>
+          <w:ilvl w:val="0"/>
+          <w:numId w:val="2"/>
+        </w:numPr>
+        <w:spacing w:after="80"/>
+      </w:pPr>
+      <w:r>
+        <w:t xml:space="preserve">A working Lynx installation on a microSD card</w:t>
+      </w:r>
+    </w:p>
+    <w:p>
+      <w:pPr>
+        <w:pStyle w:val="ListParagraph"/>
+        <w:numPr>
+          <w:ilvl w:val="0"/>
+          <w:numId w:val="2"/>
+        </w:numPr>
+        <w:spacing w:after="80"/>
+      </w:pPr>
+      <w:r>
+        <w:t xml:space="preserve">An NVMe HAT — the 52Pi M.2 NVMe 2280 PoE+ HAT is the recommended one</w:t>
+      </w:r>
+    </w:p>
+    <w:p>
+      <w:pPr>
+        <w:pStyle w:val="ListParagraph"/>
+        <w:numPr>
+          <w:ilvl w:val="0"/>
+          <w:numId w:val="2"/>
+        </w:numPr>
+        <w:spacing w:after="80"/>
+      </w:pPr>
+      <w:r>
+        <w:t xml:space="preserve">An NVMe drive — the official Raspberry Pi SSD is strongly recommended. 256GB is ample; Lynx uses a fraction of it</w:t>
+      </w:r>
+    </w:p>
+    <w:p>
+      <w:pPr>
+        <w:pStyle w:val="ListParagraph"/>
+        <w:numPr>
+          <w:ilvl w:val="0"/>
+          <w:numId w:val="2"/>
+        </w:numPr>
+        <w:spacing w:after="80"/>
+      </w:pPr>
+      <w:r>
+        <w:t xml:space="preserve">A monitor, keyboard and mouse connected to the Pi</w:t>
+      </w:r>
+    </w:p>
+    <w:p>
+      <w:pPr>
+        <w:pBdr>
+          <w:left w:val="single" w:color="E8A33D" w:sz="12" w:space="8"/>
+        </w:pBdr>
+        <w:shd w:fill="FFF4E5" w:val="clear"/>
+        <w:spacing w:after="200" w:before="100"/>
+        <w:ind w:left="200"/>
+      </w:pPr>
+      <w:r>
+        <w:rPr>
+          <w:i/>
+          <w:iCs/>
+          <w:sz w:val="20"/>
+          <w:szCs w:val="20"/>
+        </w:rPr>
+        <w:t xml:space="preserve">Use the official Raspberry Pi SSD if you can. It is tested against the Pi 5, its power draw is known to be within budget, and it removes an entire category of problem. Some third-party drives — particularly the very cheap and the very fast — draw more power than the Pi can comfortably supply, or are simply unreliable on it. There is nothing to gain from a fast drive here; Lynx is not disk-bound.</w:t>
+      </w:r>
+    </w:p>
+    <w:p>
+      <w:pPr>
+        <w:pBdr>
+          <w:left w:val="single" w:color="E8A33D" w:sz="12" w:space="8"/>
+        </w:pBdr>
+        <w:shd w:fill="FFF4E5" w:val="clear"/>
+        <w:spacing w:after="200" w:before="100"/>
+        <w:ind w:left="200"/>
+      </w:pPr>
+      <w:r>
+        <w:rPr>
+          <w:i/>
+          <w:iCs/>
+          <w:sz w:val="20"/>
+          <w:szCs w:val="20"/>
+        </w:rPr>
+        <w:t xml:space="preserve">The official SSD is an M.2 2230 — that is, 30mm long. The 52Pi HAT has a full-length 2280 slot, so the drive will look lost in it. This is fine: move the retaining standoff to the 2230 position before fitting, so the drive is supported at the correct point rather than left to flex.</w:t>
+      </w:r>
+    </w:p>
+    <w:p>
+      <w:pPr>
+        <w:pStyle w:val="Heading2"/>
+        <w:spacing w:after="150" w:before="300"/>
+      </w:pPr>
+      <w:r>
+        <w:t xml:space="preserve">A.2 Update the Firmware</w:t>
+      </w:r>
+    </w:p>
+    <w:p>
+      <w:pPr>
+        <w:spacing w:after="150"/>
+      </w:pPr>
+      <w:r>
+        <w:t xml:space="preserve">The Pi 5's boot firmware needs to be reasonably current before it will boot from NVMe. This is the single most common reason a migration fails, so do it first even if you think the Pi is up to date.</w:t>
+      </w:r>
+    </w:p>
+    <w:p>
+      <w:pPr>
+        <w:spacing w:after="150"/>
+      </w:pPr>
+      <w:r>
+        <w:t xml:space="preserve">Open a terminal and run:</w:t>
+      </w:r>
+    </w:p>
+    <w:p>
+      <w:pPr>
+        <w:shd w:fill="F0F0F0" w:val="clear"/>
+        <w:spacing w:after="150" w:before="100"/>
+        <w:ind w:left="360"/>
+      </w:pPr>
+      <w:r>
+        <w:rPr>
+          <w:rFonts w:ascii="Consolas" w:cs="Consolas" w:eastAsia="Consolas" w:hAnsi="Consolas"/>
+          <w:sz w:val="20"/>
+          <w:szCs w:val="20"/>
+        </w:rPr>
+        <w:t xml:space="preserve">sudo apt update &amp;&amp; sudo apt full-upgrade -y</w:t>
+      </w:r>
+    </w:p>
+    <w:p>
+      <w:pPr>
+        <w:shd w:fill="F0F0F0" w:val="clear"/>
+        <w:spacing w:after="150" w:before="100"/>
+        <w:ind w:left="360"/>
+      </w:pPr>
+      <w:r>
+        <w:rPr>
+          <w:rFonts w:ascii="Consolas" w:cs="Consolas" w:eastAsia="Consolas" w:hAnsi="Consolas"/>
+          <w:sz w:val="20"/>
+          <w:szCs w:val="20"/>
+        </w:rPr>
+        <w:t xml:space="preserve">sudo rpi-eeprom-update -a</w:t>
+      </w:r>
+    </w:p>
+    <w:p>
+      <w:pPr>
+        <w:shd w:fill="F0F0F0" w:val="clear"/>
+        <w:spacing w:after="150" w:before="100"/>
+        <w:ind w:left="360"/>
+      </w:pPr>
+      <w:r>
+        <w:rPr>
+          <w:rFonts w:ascii="Consolas" w:cs="Consolas" w:eastAsia="Consolas" w:hAnsi="Consolas"/>
+          <w:sz w:val="20"/>
+          <w:szCs w:val="20"/>
+        </w:rPr>
+        <w:t xml:space="preserve">sudo reboot</w:t>
+      </w:r>
+    </w:p>
+    <w:p>
+      <w:pPr>
+        <w:spacing w:after="150"/>
+      </w:pPr>
+      <w:r>
+        <w:t xml:space="preserve">After the reboot, confirm the firmware date:</w:t>
+      </w:r>
+    </w:p>
+    <w:p>
+      <w:pPr>
+        <w:shd w:fill="F0F0F0" w:val="clear"/>
+        <w:spacing w:after="150" w:before="100"/>
+        <w:ind w:left="360"/>
+      </w:pPr>
+      <w:r>
+        <w:rPr>
+          <w:rFonts w:ascii="Consolas" w:cs="Consolas" w:eastAsia="Consolas" w:hAnsi="Consolas"/>
+          <w:sz w:val="20"/>
+          <w:szCs w:val="20"/>
+        </w:rPr>
+        <w:t xml:space="preserve">sudo rpi-eeprom-update</w:t>
+      </w:r>
+    </w:p>
+    <w:p>
+      <w:pPr>
+        <w:spacing w:after="150"/>
+      </w:pPr>
+      <w:r>
+        <w:t xml:space="preserve">You are looking for a CURRENT date of December 2023 or later. Anything older than that predates NVMe boot support.</w:t>
+      </w:r>
+    </w:p>
+    <w:p>
+      <w:pPr>
+        <w:pStyle w:val="Heading2"/>
+        <w:spacing w:after="150" w:before="300"/>
+      </w:pPr>
+      <w:r>
+        <w:t xml:space="preserve">A.3 Fit the HAT and Drive</w:t>
+      </w:r>
+    </w:p>
+    <w:p>
+      <w:pPr>
+        <w:spacing w:after="150"/>
+      </w:pPr>
+      <w:r>
+        <w:t xml:space="preserve">Shut the Pi down properly before touching any hardware:</w:t>
+      </w:r>
+    </w:p>
+    <w:p>
+      <w:pPr>
+        <w:shd w:fill="F0F0F0" w:val="clear"/>
+        <w:spacing w:after="150" w:before="100"/>
+        <w:ind w:left="360"/>
+      </w:pPr>
+      <w:r>
+        <w:rPr>
+          <w:rFonts w:ascii="Consolas" w:cs="Consolas" w:eastAsia="Consolas" w:hAnsi="Consolas"/>
+          <w:sz w:val="20"/>
+          <w:szCs w:val="20"/>
+        </w:rPr>
+        <w:t xml:space="preserve">sudo shutdown -h now</w:t>
+      </w:r>
+    </w:p>
+    <w:p>
+      <w:pPr>
+        <w:spacing w:after="150"/>
+      </w:pPr>
+      <w:r>
+        <w:t xml:space="preserve">Wait for the activity LED to stop, then disconnect the power. Fit the NVMe drive to the HAT first — it slots in at an angle and is then secured flat with the retaining screw — and fit the HAT to the Pi, connecting the PCIe ribbon cable if your HAT uses one. Take care over the cable's orientation.</w:t>
+      </w:r>
+    </w:p>
+    <w:p>
+      <w:pPr>
+        <w:spacing w:after="150"/>
+      </w:pPr>
+      <w:r>
+        <w:t xml:space="preserve">Power up and let Lynx boot from the SD card as usual.</w:t>
+      </w:r>
+    </w:p>
+    <w:p>
+      <w:pPr>
+        <w:pStyle w:val="Heading2"/>
+        <w:spacing w:after="150" w:before="300"/>
+      </w:pPr>
+      <w:r>
+        <w:t xml:space="preserve">A.4 Check the Drive Is Detected</w:t>
+      </w:r>
+    </w:p>
+    <w:p>
+      <w:pPr>
+        <w:spacing w:after="150"/>
+      </w:pPr>
+      <w:r>
+        <w:t xml:space="preserve">In a terminal:</w:t>
+      </w:r>
+    </w:p>
+    <w:p>
+      <w:pPr>
+        <w:shd w:fill="F0F0F0" w:val="clear"/>
+        <w:spacing w:after="150" w:before="100"/>
+        <w:ind w:left="360"/>
+      </w:pPr>
+      <w:r>
+        <w:rPr>
+          <w:rFonts w:ascii="Consolas" w:cs="Consolas" w:eastAsia="Consolas" w:hAnsi="Consolas"/>
+          <w:sz w:val="20"/>
+          <w:szCs w:val="20"/>
+        </w:rPr>
+        <w:t xml:space="preserve">lsblk</w:t>
+      </w:r>
+    </w:p>
+    <w:p>
+      <w:pPr>
+        <w:spacing w:after="150"/>
+      </w:pPr>
+      <w:r>
+        <w:t xml:space="preserve">You should see your SD card as mmcblk0 and the new drive as nvme0n1, showing its full capacity. If nvme0n1 is missing, the Pi has not seen the drive — see Section A.8 before going any further.</w:t>
+      </w:r>
+    </w:p>
+    <w:p>
+      <w:pPr>
+        <w:pBdr>
+          <w:left w:val="single" w:color="E8A33D" w:sz="12" w:space="8"/>
+        </w:pBdr>
+        <w:shd w:fill="FFF4E5" w:val="clear"/>
+        <w:spacing w:after="200" w:before="100"/>
+        <w:ind w:left="200"/>
+      </w:pPr>
+      <w:r>
+        <w:rPr>
+          <w:i/>
+          <w:iCs/>
+          <w:sz w:val="20"/>
+          <w:szCs w:val="20"/>
+        </w:rPr>
+        <w:t xml:space="preserve">Do not continue until the drive appears in lsblk. Everything that follows assumes the Pi can see it.</w:t>
+      </w:r>
+    </w:p>
+    <w:p>
+      <w:pPr>
+        <w:pStyle w:val="Heading2"/>
+        <w:spacing w:after="150" w:before="300"/>
+      </w:pPr>
+      <w:r>
+        <w:t xml:space="preserve">A.5 Copy the SD Card to the NVMe Drive</w:t>
+      </w:r>
+    </w:p>
+    <w:p>
+      <w:pPr>
+        <w:spacing w:after="150"/>
+      </w:pPr>
+      <w:r>
+        <w:t xml:space="preserve">Raspberry Pi OS includes a tool for exactly this job. From the desktop menu, go to Accessories, then SD Card Copier.</w:t>
+      </w:r>
+    </w:p>
+    <w:p>
+      <w:pPr>
+        <w:spacing w:after="150"/>
+      </w:pPr>
+      <w:r>
+        <w:t xml:space="preserve">In the window that opens:</w:t>
+      </w:r>
+    </w:p>
+    <w:p>
+      <w:pPr>
+        <w:pStyle w:val="ListParagraph"/>
+        <w:numPr>
+          <w:ilvl w:val="0"/>
+          <w:numId w:val="2"/>
+        </w:numPr>
+        <w:spacing w:after="80"/>
+      </w:pPr>
+      <w:r>
+        <w:t xml:space="preserve">Copy From Device — select the SD card (mmcblk0)</w:t>
+      </w:r>
+    </w:p>
+    <w:p>
+      <w:pPr>
+        <w:pStyle w:val="ListParagraph"/>
+        <w:numPr>
+          <w:ilvl w:val="0"/>
+          <w:numId w:val="2"/>
+        </w:numPr>
+        <w:spacing w:after="80"/>
+      </w:pPr>
+      <w:r>
+        <w:t xml:space="preserve">Copy To Device — select the NVMe drive (nvme0n1)</w:t>
+      </w:r>
+    </w:p>
+    <w:p>
+      <w:pPr>
+        <w:pStyle w:val="ListParagraph"/>
+        <w:numPr>
+          <w:ilvl w:val="0"/>
+          <w:numId w:val="2"/>
+        </w:numPr>
+        <w:spacing w:after="80"/>
+      </w:pPr>
+      <w:r>
+        <w:t xml:space="preserve">Leave “New Partition UUIDs” ticked</w:t>
+      </w:r>
+    </w:p>
+    <w:p>
+      <w:pPr>
+        <w:pStyle w:val="ListParagraph"/>
+        <w:numPr>
+          <w:ilvl w:val="0"/>
+          <w:numId w:val="2"/>
+        </w:numPr>
+        <w:spacing w:after="80"/>
+      </w:pPr>
+      <w:r>
+        <w:t xml:space="preserve">Click Start, and confirm when it warns that the target will be erased</w:t>
+      </w:r>
+    </w:p>
+    <w:p>
+      <w:pPr>
+        <w:spacing w:after="150"/>
+      </w:pPr>
+      <w:r>
+        <w:t xml:space="preserve">The copy takes ten to fifteen minutes. It is safe to leave the Pi running normally while it works, though it is best not to make configuration changes in the Web Control Portal during the copy.</w:t>
+      </w:r>
+    </w:p>
+    <w:p>
+      <w:pPr>
+        <w:pBdr>
+          <w:left w:val="single" w:color="E8A33D" w:sz="12" w:space="8"/>
+        </w:pBdr>
+        <w:shd w:fill="FFF4E5" w:val="clear"/>
+        <w:spacing w:after="200" w:before="100"/>
+        <w:ind w:left="200"/>
+      </w:pPr>
+      <w:r>
+        <w:rPr>
+          <w:i/>
+          <w:iCs/>
+          <w:sz w:val="20"/>
+          <w:szCs w:val="20"/>
+        </w:rPr>
+        <w:t xml:space="preserve">Ticking “New Partition UUIDs” means the two drives end up with different identifiers, so the Pi cannot become confused about which one to boot from when both are present. Leave it ticked.</w:t>
+      </w:r>
+    </w:p>
+    <w:p>
+      <w:pPr>
+        <w:pStyle w:val="Heading2"/>
+        <w:spacing w:after="150" w:before="300"/>
+      </w:pPr>
+      <w:r>
+        <w:t xml:space="preserve">A.6 Set the Boot Order</w:t>
+      </w:r>
+    </w:p>
+    <w:p>
+      <w:pPr>
+        <w:spacing w:after="150"/>
+      </w:pPr>
+      <w:r>
+        <w:t xml:space="preserve">The Pi will still boot from the SD card by default. Tell the firmware to look at the NVMe drive first:</w:t>
+      </w:r>
+    </w:p>
+    <w:p>
+      <w:pPr>
+        <w:shd w:fill="F0F0F0" w:val="clear"/>
+        <w:spacing w:after="150" w:before="100"/>
+        <w:ind w:left="360"/>
+      </w:pPr>
+      <w:r>
+        <w:rPr>
+          <w:rFonts w:ascii="Consolas" w:cs="Consolas" w:eastAsia="Consolas" w:hAnsi="Consolas"/>
+          <w:sz w:val="20"/>
+          <w:szCs w:val="20"/>
+        </w:rPr>
+        <w:t xml:space="preserve">sudo raspi-config</w:t>
+      </w:r>
+    </w:p>
+    <w:p>
+      <w:pPr>
+        <w:spacing w:after="150"/>
+      </w:pPr>
+      <w:r>
+        <w:t xml:space="preserve">Then navigate to:</w:t>
+      </w:r>
+    </w:p>
+    <w:p>
+      <w:pPr>
+        <w:pStyle w:val="ListParagraph"/>
+        <w:numPr>
+          <w:ilvl w:val="0"/>
+          <w:numId w:val="2"/>
+        </w:numPr>
+        <w:spacing w:after="80"/>
+      </w:pPr>
+      <w:r>
+        <w:t xml:space="preserve">6 Advanced Options</w:t>
+      </w:r>
+    </w:p>
+    <w:p>
+      <w:pPr>
+        <w:pStyle w:val="ListParagraph"/>
+        <w:numPr>
+          <w:ilvl w:val="0"/>
+          <w:numId w:val="2"/>
+        </w:numPr>
+        <w:spacing w:after="80"/>
+      </w:pPr>
+      <w:r>
+        <w:t xml:space="preserve">A4 Boot Order</w:t>
+      </w:r>
+    </w:p>
+    <w:p>
+      <w:pPr>
+        <w:pStyle w:val="ListParagraph"/>
+        <w:numPr>
+          <w:ilvl w:val="0"/>
+          <w:numId w:val="2"/>
+        </w:numPr>
+        <w:spacing w:after="80"/>
+      </w:pPr>
+      <w:r>
+        <w:t xml:space="preserve">B2 NVMe/USB Boot</w:t>
+      </w:r>
+    </w:p>
+    <w:p>
+      <w:pPr>
+        <w:spacing w:after="150"/>
+      </w:pPr>
+      <w:r>
+        <w:t xml:space="preserve">Select Finish, and reboot when prompted. This setting is stored in the Pi's EEPROM, not on either drive, so it survives everything you do to the storage afterwards.</w:t>
+      </w:r>
+    </w:p>
+    <w:p>
+      <w:pPr>
+        <w:pStyle w:val="Heading2"/>
+        <w:spacing w:after="150" w:before="300"/>
+      </w:pPr>
+      <w:r>
+        <w:t xml:space="preserve">A.7 Remove the SD Card and Verify</w:t>
+      </w:r>
+    </w:p>
+    <w:p>
+      <w:pPr>
+        <w:spacing w:after="150"/>
+      </w:pPr>
+      <w:r>
+        <w:t xml:space="preserve">Shut down cleanly:</w:t>
+      </w:r>
+    </w:p>
+    <w:p>
+      <w:pPr>
+        <w:shd w:fill="F0F0F0" w:val="clear"/>
+        <w:spacing w:after="150" w:before="100"/>
+        <w:ind w:left="360"/>
+      </w:pPr>
+      <w:r>
+        <w:rPr>
+          <w:rFonts w:ascii="Consolas" w:cs="Consolas" w:eastAsia="Consolas" w:hAnsi="Consolas"/>
+          <w:sz w:val="20"/>
+          <w:szCs w:val="20"/>
+        </w:rPr>
+        <w:t xml:space="preserve">sudo shutdown -h now</w:t>
+      </w:r>
+    </w:p>
+    <w:p>
+      <w:pPr>
+        <w:spacing w:after="150"/>
+      </w:pPr>
+      <w:r>
+        <w:t xml:space="preserve">Wait for the activity LED to stop, remove the power, and take out the microSD card. Keep it somewhere safe — it is a complete, working backup of your installation, and if anything goes wrong you can put it straight back in and be running again in two minutes.</w:t>
+      </w:r>
+    </w:p>
+    <w:p>
+      <w:pPr>
+        <w:spacing w:after="150"/>
+      </w:pPr>
+      <w:r>
+        <w:t xml:space="preserve">Reconnect the power. The Pi should now boot from NVMe. Once Lynx is up:</w:t>
+      </w:r>
+    </w:p>
+    <w:p>
+      <w:pPr>
+        <w:shd w:fill="F0F0F0" w:val="clear"/>
+        <w:spacing w:after="150" w:before="100"/>
+        <w:ind w:left="360"/>
+      </w:pPr>
+      <w:r>
+        <w:rPr>
+          <w:rFonts w:ascii="Consolas" w:cs="Consolas" w:eastAsia="Consolas" w:hAnsi="Consolas"/>
+          <w:sz w:val="20"/>
+          <w:szCs w:val="20"/>
+        </w:rPr>
+        <w:t xml:space="preserve">findmnt /</w:t>
+      </w:r>
+    </w:p>
+    <w:p>
+      <w:pPr>
+        <w:spacing w:after="150"/>
+      </w:pPr>
+      <w:r>
+        <w:t xml:space="preserve">The SOURCE column should show /dev/nvme0n1p2. Check the free space too, which should now reflect the size of your NVMe drive:</w:t>
+      </w:r>
+    </w:p>
+    <w:p>
+      <w:pPr>
+        <w:shd w:fill="F0F0F0" w:val="clear"/>
+        <w:spacing w:after="150" w:before="100"/>
+        <w:ind w:left="360"/>
+      </w:pPr>
+      <w:r>
+        <w:rPr>
+          <w:rFonts w:ascii="Consolas" w:cs="Consolas" w:eastAsia="Consolas" w:hAnsi="Consolas"/>
+          <w:sz w:val="20"/>
+          <w:szCs w:val="20"/>
+        </w:rPr>
+        <w:t xml:space="preserve">df -h /</w:t>
+      </w:r>
+    </w:p>
+    <w:p>
+      <w:pPr>
+        <w:spacing w:after="150"/>
+      </w:pPr>
+      <w:r>
+        <w:t xml:space="preserve">Finally, open the Web Control Portal and confirm your Picotuner IP address, site details and any memory presets have all come across. They should have — the copy is a faithful clone. Work through the verification checklist in Section 9 if you want to be thorough.</w:t>
+      </w:r>
+    </w:p>
+    <w:p>
+      <w:pPr>
+        <w:pStyle w:val="Heading2"/>
+        <w:spacing w:after="150" w:before="300"/>
+      </w:pPr>
+      <w:r>
+        <w:t xml:space="preserve">A.8 Troubleshooting</w:t>
+      </w:r>
+    </w:p>
+    <w:p>
+      <w:pPr>
+        <w:pStyle w:val="Heading3"/>
+        <w:spacing w:after="120" w:before="260"/>
+      </w:pPr>
+      <w:r>
+        <w:t xml:space="preserve">The NVMe drive does not appear in lsblk</w:t>
+      </w:r>
+    </w:p>
+    <w:p>
+      <w:pPr>
+        <w:spacing w:after="150"/>
+      </w:pPr>
+      <w:r>
+        <w:t xml:space="preserve">Shut down, disconnect the power, and reseat both the drive in the HAT and the ribbon cable at the PCIe connector. A cable fitted the wrong way round, or not pushed fully home, accounts for most cases.</w:t>
+      </w:r>
+    </w:p>
+    <w:p>
+      <w:pPr>
+        <w:spacing w:after="150"/>
+      </w:pPr>
+      <w:r>
+        <w:t xml:space="preserve">If it is still missing, explicitly enable the PCIe connector:</w:t>
+      </w:r>
+    </w:p>
+    <w:p>
+      <w:pPr>
+        <w:shd w:fill="F0F0F0" w:val="clear"/>
+        <w:spacing w:after="150" w:before="100"/>
+        <w:ind w:left="360"/>
+      </w:pPr>
+      <w:r>
+        <w:rPr>
+          <w:rFonts w:ascii="Consolas" w:cs="Consolas" w:eastAsia="Consolas" w:hAnsi="Consolas"/>
+          <w:sz w:val="20"/>
+          <w:szCs w:val="20"/>
+        </w:rPr>
+        <w:t xml:space="preserve">sudo nano /boot/firmware/config.txt</w:t>
+      </w:r>
+    </w:p>
+    <w:p>
+      <w:pPr>
+        <w:spacing w:after="150"/>
+      </w:pPr>
+      <w:r>
+        <w:t xml:space="preserve">Add this line at the end, then save with Ctrl+O and exit with Ctrl+X:</w:t>
+      </w:r>
+    </w:p>
+    <w:p>
+      <w:pPr>
+        <w:shd w:fill="F0F0F0" w:val="clear"/>
+        <w:spacing w:after="150" w:before="100"/>
+        <w:ind w:left="360"/>
+      </w:pPr>
+      <w:r>
+        <w:rPr>
+          <w:rFonts w:ascii="Consolas" w:cs="Consolas" w:eastAsia="Consolas" w:hAnsi="Consolas"/>
+          <w:sz w:val="20"/>
+          <w:szCs w:val="20"/>
+        </w:rPr>
+        <w:t xml:space="preserve">dtparam=pciex1</w:t>
+      </w:r>
+    </w:p>
+    <w:p>
+      <w:pPr>
+        <w:spacing w:after="150"/>
+      </w:pPr>
+      <w:r>
+        <w:t xml:space="preserve">Reboot and check lsblk again.</w:t>
+      </w:r>
+    </w:p>
+    <w:p>
+      <w:pPr>
+        <w:pStyle w:val="Heading3"/>
+        <w:spacing w:after="120" w:before="260"/>
+      </w:pPr>
+      <w:r>
+        <w:t xml:space="preserve">It boots to a rainbow screen, or does not boot at all</w:t>
+      </w:r>
+    </w:p>
+    <w:p>
+      <w:pPr>
+        <w:spacing w:after="150"/>
+      </w:pPr>
+      <w:r>
+        <w:t xml:space="preserve">Put the SD card back in. It still contains your working installation, and with the boot order set to try NVMe first and fall back to SD, the Pi will start from the card and let you investigate. Nothing is lost.</w:t>
+      </w:r>
+    </w:p>
+    <w:p>
+      <w:pPr>
+        <w:pStyle w:val="Heading3"/>
+        <w:spacing w:after="120" w:before="260"/>
+      </w:pPr>
+      <w:r>
+        <w:t xml:space="preserve">Everything works, but the drive occasionally drops out</w:t>
+      </w:r>
+    </w:p>
+    <w:p>
+      <w:pPr>
+        <w:spacing w:after="150"/>
+      </w:pPr>
+      <w:r>
+        <w:t xml:space="preserve">This is almost always power. The Pi 5 needs its full 5A supply, or PoE+ rather than standard PoE, once a drive is drawing from it. A drive that works on the bench and misbehaves at a site is worth checking against the site's PoE budget before suspecting the drive itself.</w:t>
+      </w:r>
+    </w:p>
+    <w:p>
+      <w:pPr>
+        <w:pStyle w:val="Heading3"/>
+        <w:spacing w:after="120" w:before="260"/>
+      </w:pPr>
+      <w:r>
+        <w:t xml:space="preserve">Can I run at PCIe Gen 3?</w:t>
+      </w:r>
+    </w:p>
+    <w:p>
+      <w:pPr>
+        <w:spacing w:after="150"/>
+      </w:pPr>
+      <w:r>
+        <w:t xml:space="preserve">You can, by adding dtparam=pciex1_gen=3 to config.txt, but it is outside the Pi 5's certified specification and not all drives are stable at that rate. There is no benefit for Lynx — the default Gen 2 speed is far more than the receiver needs. Leave it alone.</w:t>
+      </w:r>
+    </w:p>
     <w:sectPr>
       <w:pgSz w:w="12240" w:h="15840" w:orient="portrait"/>
       <w:pgMar w:top="1440" w:right="1440" w:bottom="1440" w:left="1440" w:header="708" w:footer="708" w:gutter="0"/>

</xml_diff>

<commit_message>
Add Pathfinder - end-of-contact station map
Full-screen card after a station stops transmitting, showing their location, the great-circle path back, and the contact's signal figures. Position from their QRZ locator, reusing the existing lookup. Config page controls for enabled/delay/duration, with a cross-check warning against Companion's unlock settle time. Map data pre-clipped in geo/ (Natural Earth, public domain; towns from GeoNames, CC BY) - nothing fetched at runtime. New dependency: pyshp, added to install.sh.
</commit_message>
<xml_diff>
--- a/docs/lynx_install_guide.docx
+++ b/docs/lynx_install_guide.docx
@@ -390,7 +390,7 @@
           <w:sz w:val="20"/>
           <w:szCs w:val="20"/>
         </w:rPr>
-        <w:t xml:space="preserve">curl -sSL https://raw.githubusercontent.com/G8YTZ/lynx-datv-receiver/beta/install.sh | bash</w:t>
+        <w:t xml:space="preserve">curl -sSL https://raw.githubusercontent.com/G8YTZ/lynx-datv-receiver/main/install.sh | bash</w:t>
       </w:r>
     </w:p>
     <w:p>
@@ -1307,7 +1307,7 @@
           <w:sz w:val="20"/>
           <w:szCs w:val="20"/>
         </w:rPr>
-        <w:t xml:space="preserve">git clone -b beta https://github.com/G8YTZ/lynx-datv-receiver.git ~/lynx</w:t>
+        <w:t xml:space="preserve">git clone https://github.com/G8YTZ/lynx-datv-receiver.git ~/lynx</w:t>
       </w:r>
     </w:p>
     <w:p>
@@ -2920,6 +2920,778 @@
         </w:tc>
       </w:tr>
     </w:tbl>
+    <w:p>
+      <w:r>
+        <w:br w:type="page"/>
+      </w:r>
+    </w:p>
+    <w:p>
+      <w:pPr>
+        <w:pStyle w:val="Heading1"/>
+        <w:spacing w:after="150" w:before="400"/>
+      </w:pPr>
+      <w:r>
+        <w:t xml:space="preserve">Appendix A. Moving from a microSD Card to NVMe</w:t>
+      </w:r>
+    </w:p>
+    <w:p>
+      <w:pPr>
+        <w:spacing w:after="150"/>
+      </w:pPr>
+      <w:r>
+        <w:t xml:space="preserve">SD cards are fine for getting started, but they wear out under continuous writing. A repeater receiver runs day and night, logging and updating as it goes, and sooner or later the card gives up — invariably on a wet Sunday, on a hilltop, in the dark. An NVMe drive will comfortably outlast the Pi.</w:t>
+      </w:r>
+    </w:p>
+    <w:p>
+      <w:pPr>
+        <w:spacing w:after="150"/>
+      </w:pPr>
+      <w:r>
+        <w:t xml:space="preserve">This appendix takes a working Lynx installation on a microSD card, as built in Sections 2 to 6, and moves it to an NVMe drive with all your settings intact. It takes about twenty minutes, most of which is the copy running unattended.</w:t>
+      </w:r>
+    </w:p>
+    <w:p>
+      <w:pPr>
+        <w:pBdr>
+          <w:left w:val="single" w:color="E8A33D" w:sz="12" w:space="8"/>
+        </w:pBdr>
+        <w:shd w:fill="FFF4E5" w:val="clear"/>
+        <w:spacing w:after="200" w:before="100"/>
+        <w:ind w:left="200"/>
+      </w:pPr>
+      <w:r>
+        <w:rPr>
+          <w:i/>
+          <w:iCs/>
+          <w:sz w:val="20"/>
+          <w:szCs w:val="20"/>
+        </w:rPr>
+        <w:t xml:space="preserve">Do this at the bench, with a monitor, keyboard and mouse attached — not over SSH at a remote site. You will need physical access to remove the SD card at the end.</w:t>
+      </w:r>
+    </w:p>
+    <w:p>
+      <w:pPr>
+        <w:pStyle w:val="Heading2"/>
+        <w:spacing w:after="150" w:before="300"/>
+      </w:pPr>
+      <w:r>
+        <w:t xml:space="preserve">A.1 What You’ll Need</w:t>
+      </w:r>
+    </w:p>
+    <w:p>
+      <w:pPr>
+        <w:pStyle w:val="ListParagraph"/>
+        <w:numPr>
+          <w:ilvl w:val="0"/>
+          <w:numId w:val="2"/>
+        </w:numPr>
+        <w:spacing w:after="80"/>
+      </w:pPr>
+      <w:r>
+        <w:t xml:space="preserve">A working Lynx installation on a microSD card</w:t>
+      </w:r>
+    </w:p>
+    <w:p>
+      <w:pPr>
+        <w:pStyle w:val="ListParagraph"/>
+        <w:numPr>
+          <w:ilvl w:val="0"/>
+          <w:numId w:val="2"/>
+        </w:numPr>
+        <w:spacing w:after="80"/>
+      </w:pPr>
+      <w:r>
+        <w:t xml:space="preserve">An NVMe HAT — the 52Pi M.2 NVMe 2280 PoE+ HAT is the recommended one</w:t>
+      </w:r>
+    </w:p>
+    <w:p>
+      <w:pPr>
+        <w:pStyle w:val="ListParagraph"/>
+        <w:numPr>
+          <w:ilvl w:val="0"/>
+          <w:numId w:val="2"/>
+        </w:numPr>
+        <w:spacing w:after="80"/>
+      </w:pPr>
+      <w:r>
+        <w:t xml:space="preserve">An NVMe drive — the official Raspberry Pi SSD is strongly recommended. 256GB is ample; Lynx uses a fraction of it</w:t>
+      </w:r>
+    </w:p>
+    <w:p>
+      <w:pPr>
+        <w:pStyle w:val="ListParagraph"/>
+        <w:numPr>
+          <w:ilvl w:val="0"/>
+          <w:numId w:val="2"/>
+        </w:numPr>
+        <w:spacing w:after="80"/>
+      </w:pPr>
+      <w:r>
+        <w:t xml:space="preserve">A monitor, keyboard and mouse connected to the Pi</w:t>
+      </w:r>
+    </w:p>
+    <w:p>
+      <w:pPr>
+        <w:pBdr>
+          <w:left w:val="single" w:color="E8A33D" w:sz="12" w:space="8"/>
+        </w:pBdr>
+        <w:shd w:fill="FFF4E5" w:val="clear"/>
+        <w:spacing w:after="200" w:before="100"/>
+        <w:ind w:left="200"/>
+      </w:pPr>
+      <w:r>
+        <w:rPr>
+          <w:i/>
+          <w:iCs/>
+          <w:sz w:val="20"/>
+          <w:szCs w:val="20"/>
+        </w:rPr>
+        <w:t xml:space="preserve">Use the official Raspberry Pi SSD if you can. It is tested against the Pi 5, its power draw is known to be within budget, and it removes an entire category of problem. Some third-party drives — particularly the very cheap and the very fast — draw more power than the Pi can comfortably supply, or are simply unreliable on it. There is nothing to gain from a fast drive here; Lynx is not disk-bound.</w:t>
+      </w:r>
+    </w:p>
+    <w:p>
+      <w:pPr>
+        <w:pBdr>
+          <w:left w:val="single" w:color="E8A33D" w:sz="12" w:space="8"/>
+        </w:pBdr>
+        <w:shd w:fill="FFF4E5" w:val="clear"/>
+        <w:spacing w:after="200" w:before="100"/>
+        <w:ind w:left="200"/>
+      </w:pPr>
+      <w:r>
+        <w:rPr>
+          <w:i/>
+          <w:iCs/>
+          <w:sz w:val="20"/>
+          <w:szCs w:val="20"/>
+        </w:rPr>
+        <w:t xml:space="preserve">The official SSD is an M.2 2230 — that is, 30mm long. The 52Pi HAT has a full-length 2280 slot, so the drive will look lost in it. This is fine: move the retaining standoff to the 2230 position before fitting, so the drive is supported at the correct point rather than left to flex.</w:t>
+      </w:r>
+    </w:p>
+    <w:p>
+      <w:pPr>
+        <w:pStyle w:val="Heading2"/>
+        <w:spacing w:after="150" w:before="300"/>
+      </w:pPr>
+      <w:r>
+        <w:t xml:space="preserve">A.2 Update the Firmware</w:t>
+      </w:r>
+    </w:p>
+    <w:p>
+      <w:pPr>
+        <w:spacing w:after="150"/>
+      </w:pPr>
+      <w:r>
+        <w:t xml:space="preserve">The Pi 5's boot firmware needs to be reasonably current before it will boot from NVMe. This is the single most common reason a migration fails, so do it first even if you think the Pi is up to date.</w:t>
+      </w:r>
+    </w:p>
+    <w:p>
+      <w:pPr>
+        <w:spacing w:after="150"/>
+      </w:pPr>
+      <w:r>
+        <w:t xml:space="preserve">Open a terminal and run:</w:t>
+      </w:r>
+    </w:p>
+    <w:p>
+      <w:pPr>
+        <w:shd w:fill="F0F0F0" w:val="clear"/>
+        <w:spacing w:after="150" w:before="100"/>
+        <w:ind w:left="360"/>
+      </w:pPr>
+      <w:r>
+        <w:rPr>
+          <w:rFonts w:ascii="Consolas" w:cs="Consolas" w:eastAsia="Consolas" w:hAnsi="Consolas"/>
+          <w:sz w:val="20"/>
+          <w:szCs w:val="20"/>
+        </w:rPr>
+        <w:t xml:space="preserve">sudo apt update &amp;&amp; sudo apt full-upgrade -y</w:t>
+      </w:r>
+    </w:p>
+    <w:p>
+      <w:pPr>
+        <w:shd w:fill="F0F0F0" w:val="clear"/>
+        <w:spacing w:after="150" w:before="100"/>
+        <w:ind w:left="360"/>
+      </w:pPr>
+      <w:r>
+        <w:rPr>
+          <w:rFonts w:ascii="Consolas" w:cs="Consolas" w:eastAsia="Consolas" w:hAnsi="Consolas"/>
+          <w:sz w:val="20"/>
+          <w:szCs w:val="20"/>
+        </w:rPr>
+        <w:t xml:space="preserve">sudo rpi-eeprom-update -a</w:t>
+      </w:r>
+    </w:p>
+    <w:p>
+      <w:pPr>
+        <w:shd w:fill="F0F0F0" w:val="clear"/>
+        <w:spacing w:after="150" w:before="100"/>
+        <w:ind w:left="360"/>
+      </w:pPr>
+      <w:r>
+        <w:rPr>
+          <w:rFonts w:ascii="Consolas" w:cs="Consolas" w:eastAsia="Consolas" w:hAnsi="Consolas"/>
+          <w:sz w:val="20"/>
+          <w:szCs w:val="20"/>
+        </w:rPr>
+        <w:t xml:space="preserve">sudo reboot</w:t>
+      </w:r>
+    </w:p>
+    <w:p>
+      <w:pPr>
+        <w:spacing w:after="150"/>
+      </w:pPr>
+      <w:r>
+        <w:t xml:space="preserve">After the reboot, confirm the firmware date:</w:t>
+      </w:r>
+    </w:p>
+    <w:p>
+      <w:pPr>
+        <w:shd w:fill="F0F0F0" w:val="clear"/>
+        <w:spacing w:after="150" w:before="100"/>
+        <w:ind w:left="360"/>
+      </w:pPr>
+      <w:r>
+        <w:rPr>
+          <w:rFonts w:ascii="Consolas" w:cs="Consolas" w:eastAsia="Consolas" w:hAnsi="Consolas"/>
+          <w:sz w:val="20"/>
+          <w:szCs w:val="20"/>
+        </w:rPr>
+        <w:t xml:space="preserve">sudo rpi-eeprom-update</w:t>
+      </w:r>
+    </w:p>
+    <w:p>
+      <w:pPr>
+        <w:spacing w:after="150"/>
+      </w:pPr>
+      <w:r>
+        <w:t xml:space="preserve">You are looking for a CURRENT date of December 2023 or later. Anything older than that predates NVMe boot support.</w:t>
+      </w:r>
+    </w:p>
+    <w:p>
+      <w:pPr>
+        <w:pStyle w:val="Heading2"/>
+        <w:spacing w:after="150" w:before="300"/>
+      </w:pPr>
+      <w:r>
+        <w:t xml:space="preserve">A.3 Fit the HAT and Drive</w:t>
+      </w:r>
+    </w:p>
+    <w:p>
+      <w:pPr>
+        <w:spacing w:after="150"/>
+      </w:pPr>
+      <w:r>
+        <w:t xml:space="preserve">Shut the Pi down properly before touching any hardware:</w:t>
+      </w:r>
+    </w:p>
+    <w:p>
+      <w:pPr>
+        <w:shd w:fill="F0F0F0" w:val="clear"/>
+        <w:spacing w:after="150" w:before="100"/>
+        <w:ind w:left="360"/>
+      </w:pPr>
+      <w:r>
+        <w:rPr>
+          <w:rFonts w:ascii="Consolas" w:cs="Consolas" w:eastAsia="Consolas" w:hAnsi="Consolas"/>
+          <w:sz w:val="20"/>
+          <w:szCs w:val="20"/>
+        </w:rPr>
+        <w:t xml:space="preserve">sudo shutdown -h now</w:t>
+      </w:r>
+    </w:p>
+    <w:p>
+      <w:pPr>
+        <w:spacing w:after="150"/>
+      </w:pPr>
+      <w:r>
+        <w:t xml:space="preserve">Wait for the activity LED to stop, then disconnect the power. Fit the NVMe drive to the HAT first — it slots in at an angle and is then secured flat with the retaining screw — and fit the HAT to the Pi, connecting the PCIe ribbon cable if your HAT uses one. Take care over the cable's orientation.</w:t>
+      </w:r>
+    </w:p>
+    <w:p>
+      <w:pPr>
+        <w:spacing w:after="150"/>
+      </w:pPr>
+      <w:r>
+        <w:t xml:space="preserve">Power up and let Lynx boot from the SD card as usual.</w:t>
+      </w:r>
+    </w:p>
+    <w:p>
+      <w:pPr>
+        <w:pStyle w:val="Heading2"/>
+        <w:spacing w:after="150" w:before="300"/>
+      </w:pPr>
+      <w:r>
+        <w:t xml:space="preserve">A.4 Check the Drive Is Detected</w:t>
+      </w:r>
+    </w:p>
+    <w:p>
+      <w:pPr>
+        <w:spacing w:after="150"/>
+      </w:pPr>
+      <w:r>
+        <w:t xml:space="preserve">In a terminal:</w:t>
+      </w:r>
+    </w:p>
+    <w:p>
+      <w:pPr>
+        <w:shd w:fill="F0F0F0" w:val="clear"/>
+        <w:spacing w:after="150" w:before="100"/>
+        <w:ind w:left="360"/>
+      </w:pPr>
+      <w:r>
+        <w:rPr>
+          <w:rFonts w:ascii="Consolas" w:cs="Consolas" w:eastAsia="Consolas" w:hAnsi="Consolas"/>
+          <w:sz w:val="20"/>
+          <w:szCs w:val="20"/>
+        </w:rPr>
+        <w:t xml:space="preserve">lsblk</w:t>
+      </w:r>
+    </w:p>
+    <w:p>
+      <w:pPr>
+        <w:spacing w:after="150"/>
+      </w:pPr>
+      <w:r>
+        <w:t xml:space="preserve">You should see your SD card as mmcblk0 and the new drive as nvme0n1, showing its full capacity. If nvme0n1 is missing, the Pi has not seen the drive — see Section A.8 before going any further.</w:t>
+      </w:r>
+    </w:p>
+    <w:p>
+      <w:pPr>
+        <w:pBdr>
+          <w:left w:val="single" w:color="E8A33D" w:sz="12" w:space="8"/>
+        </w:pBdr>
+        <w:shd w:fill="FFF4E5" w:val="clear"/>
+        <w:spacing w:after="200" w:before="100"/>
+        <w:ind w:left="200"/>
+      </w:pPr>
+      <w:r>
+        <w:rPr>
+          <w:i/>
+          <w:iCs/>
+          <w:sz w:val="20"/>
+          <w:szCs w:val="20"/>
+        </w:rPr>
+        <w:t xml:space="preserve">Do not continue until the drive appears in lsblk. Everything that follows assumes the Pi can see it.</w:t>
+      </w:r>
+    </w:p>
+    <w:p>
+      <w:pPr>
+        <w:pStyle w:val="Heading2"/>
+        <w:spacing w:after="150" w:before="300"/>
+      </w:pPr>
+      <w:r>
+        <w:t xml:space="preserve">A.5 Copy the SD Card to the NVMe Drive</w:t>
+      </w:r>
+    </w:p>
+    <w:p>
+      <w:pPr>
+        <w:spacing w:after="150"/>
+      </w:pPr>
+      <w:r>
+        <w:t xml:space="preserve">Raspberry Pi OS includes a tool for exactly this job. From the desktop menu, go to Accessories, then SD Card Copier.</w:t>
+      </w:r>
+    </w:p>
+    <w:p>
+      <w:pPr>
+        <w:spacing w:after="150"/>
+      </w:pPr>
+      <w:r>
+        <w:t xml:space="preserve">In the window that opens:</w:t>
+      </w:r>
+    </w:p>
+    <w:p>
+      <w:pPr>
+        <w:pStyle w:val="ListParagraph"/>
+        <w:numPr>
+          <w:ilvl w:val="0"/>
+          <w:numId w:val="2"/>
+        </w:numPr>
+        <w:spacing w:after="80"/>
+      </w:pPr>
+      <w:r>
+        <w:t xml:space="preserve">Copy From Device — select the SD card (mmcblk0)</w:t>
+      </w:r>
+    </w:p>
+    <w:p>
+      <w:pPr>
+        <w:pStyle w:val="ListParagraph"/>
+        <w:numPr>
+          <w:ilvl w:val="0"/>
+          <w:numId w:val="2"/>
+        </w:numPr>
+        <w:spacing w:after="80"/>
+      </w:pPr>
+      <w:r>
+        <w:t xml:space="preserve">Copy To Device — select the NVMe drive (nvme0n1)</w:t>
+      </w:r>
+    </w:p>
+    <w:p>
+      <w:pPr>
+        <w:pStyle w:val="ListParagraph"/>
+        <w:numPr>
+          <w:ilvl w:val="0"/>
+          <w:numId w:val="2"/>
+        </w:numPr>
+        <w:spacing w:after="80"/>
+      </w:pPr>
+      <w:r>
+        <w:t xml:space="preserve">Leave “New Partition UUIDs” ticked</w:t>
+      </w:r>
+    </w:p>
+    <w:p>
+      <w:pPr>
+        <w:pStyle w:val="ListParagraph"/>
+        <w:numPr>
+          <w:ilvl w:val="0"/>
+          <w:numId w:val="2"/>
+        </w:numPr>
+        <w:spacing w:after="80"/>
+      </w:pPr>
+      <w:r>
+        <w:t xml:space="preserve">Click Start, and confirm when it warns that the target will be erased</w:t>
+      </w:r>
+    </w:p>
+    <w:p>
+      <w:pPr>
+        <w:spacing w:after="150"/>
+      </w:pPr>
+      <w:r>
+        <w:t xml:space="preserve">The copy takes ten to fifteen minutes. It is safe to leave the Pi running normally while it works, though it is best not to make configuration changes in the Web Control Portal during the copy.</w:t>
+      </w:r>
+    </w:p>
+    <w:p>
+      <w:pPr>
+        <w:pBdr>
+          <w:left w:val="single" w:color="E8A33D" w:sz="12" w:space="8"/>
+        </w:pBdr>
+        <w:shd w:fill="FFF4E5" w:val="clear"/>
+        <w:spacing w:after="200" w:before="100"/>
+        <w:ind w:left="200"/>
+      </w:pPr>
+      <w:r>
+        <w:rPr>
+          <w:i/>
+          <w:iCs/>
+          <w:sz w:val="20"/>
+          <w:szCs w:val="20"/>
+        </w:rPr>
+        <w:t xml:space="preserve">Ticking “New Partition UUIDs” means the two drives end up with different identifiers, so the Pi cannot become confused about which one to boot from when both are present. Leave it ticked.</w:t>
+      </w:r>
+    </w:p>
+    <w:p>
+      <w:pPr>
+        <w:pStyle w:val="Heading2"/>
+        <w:spacing w:after="150" w:before="300"/>
+      </w:pPr>
+      <w:r>
+        <w:t xml:space="preserve">A.6 Set the Boot Order</w:t>
+      </w:r>
+    </w:p>
+    <w:p>
+      <w:pPr>
+        <w:spacing w:after="150"/>
+      </w:pPr>
+      <w:r>
+        <w:t xml:space="preserve">The Pi will still boot from the SD card by default. Tell the firmware to look at the NVMe drive first:</w:t>
+      </w:r>
+    </w:p>
+    <w:p>
+      <w:pPr>
+        <w:shd w:fill="F0F0F0" w:val="clear"/>
+        <w:spacing w:after="150" w:before="100"/>
+        <w:ind w:left="360"/>
+      </w:pPr>
+      <w:r>
+        <w:rPr>
+          <w:rFonts w:ascii="Consolas" w:cs="Consolas" w:eastAsia="Consolas" w:hAnsi="Consolas"/>
+          <w:sz w:val="20"/>
+          <w:szCs w:val="20"/>
+        </w:rPr>
+        <w:t xml:space="preserve">sudo raspi-config</w:t>
+      </w:r>
+    </w:p>
+    <w:p>
+      <w:pPr>
+        <w:spacing w:after="150"/>
+      </w:pPr>
+      <w:r>
+        <w:t xml:space="preserve">Then navigate to:</w:t>
+      </w:r>
+    </w:p>
+    <w:p>
+      <w:pPr>
+        <w:pStyle w:val="ListParagraph"/>
+        <w:numPr>
+          <w:ilvl w:val="0"/>
+          <w:numId w:val="2"/>
+        </w:numPr>
+        <w:spacing w:after="80"/>
+      </w:pPr>
+      <w:r>
+        <w:t xml:space="preserve">6 Advanced Options</w:t>
+      </w:r>
+    </w:p>
+    <w:p>
+      <w:pPr>
+        <w:pStyle w:val="ListParagraph"/>
+        <w:numPr>
+          <w:ilvl w:val="0"/>
+          <w:numId w:val="2"/>
+        </w:numPr>
+        <w:spacing w:after="80"/>
+      </w:pPr>
+      <w:r>
+        <w:t xml:space="preserve">A4 Boot Order</w:t>
+      </w:r>
+    </w:p>
+    <w:p>
+      <w:pPr>
+        <w:pStyle w:val="ListParagraph"/>
+        <w:numPr>
+          <w:ilvl w:val="0"/>
+          <w:numId w:val="2"/>
+        </w:numPr>
+        <w:spacing w:after="80"/>
+      </w:pPr>
+      <w:r>
+        <w:t xml:space="preserve">B2 NVMe/USB Boot</w:t>
+      </w:r>
+    </w:p>
+    <w:p>
+      <w:pPr>
+        <w:spacing w:after="150"/>
+      </w:pPr>
+      <w:r>
+        <w:t xml:space="preserve">Select Finish, and reboot when prompted. This setting is stored in the Pi's EEPROM, not on either drive, so it survives everything you do to the storage afterwards.</w:t>
+      </w:r>
+    </w:p>
+    <w:p>
+      <w:pPr>
+        <w:pStyle w:val="Heading2"/>
+        <w:spacing w:after="150" w:before="300"/>
+      </w:pPr>
+      <w:r>
+        <w:t xml:space="preserve">A.7 Remove the SD Card and Verify</w:t>
+      </w:r>
+    </w:p>
+    <w:p>
+      <w:pPr>
+        <w:spacing w:after="150"/>
+      </w:pPr>
+      <w:r>
+        <w:t xml:space="preserve">Shut down cleanly:</w:t>
+      </w:r>
+    </w:p>
+    <w:p>
+      <w:pPr>
+        <w:shd w:fill="F0F0F0" w:val="clear"/>
+        <w:spacing w:after="150" w:before="100"/>
+        <w:ind w:left="360"/>
+      </w:pPr>
+      <w:r>
+        <w:rPr>
+          <w:rFonts w:ascii="Consolas" w:cs="Consolas" w:eastAsia="Consolas" w:hAnsi="Consolas"/>
+          <w:sz w:val="20"/>
+          <w:szCs w:val="20"/>
+        </w:rPr>
+        <w:t xml:space="preserve">sudo shutdown -h now</w:t>
+      </w:r>
+    </w:p>
+    <w:p>
+      <w:pPr>
+        <w:spacing w:after="150"/>
+      </w:pPr>
+      <w:r>
+        <w:t xml:space="preserve">Wait for the activity LED to stop, remove the power, and take out the microSD card. Keep it somewhere safe — it is a complete, working backup of your installation, and if anything goes wrong you can put it straight back in and be running again in two minutes.</w:t>
+      </w:r>
+    </w:p>
+    <w:p>
+      <w:pPr>
+        <w:spacing w:after="150"/>
+      </w:pPr>
+      <w:r>
+        <w:t xml:space="preserve">Reconnect the power. The Pi should now boot from NVMe. Once Lynx is up:</w:t>
+      </w:r>
+    </w:p>
+    <w:p>
+      <w:pPr>
+        <w:shd w:fill="F0F0F0" w:val="clear"/>
+        <w:spacing w:after="150" w:before="100"/>
+        <w:ind w:left="360"/>
+      </w:pPr>
+      <w:r>
+        <w:rPr>
+          <w:rFonts w:ascii="Consolas" w:cs="Consolas" w:eastAsia="Consolas" w:hAnsi="Consolas"/>
+          <w:sz w:val="20"/>
+          <w:szCs w:val="20"/>
+        </w:rPr>
+        <w:t xml:space="preserve">findmnt /</w:t>
+      </w:r>
+    </w:p>
+    <w:p>
+      <w:pPr>
+        <w:spacing w:after="150"/>
+      </w:pPr>
+      <w:r>
+        <w:t xml:space="preserve">The SOURCE column should show /dev/nvme0n1p2. Check the free space too, which should now reflect the size of your NVMe drive:</w:t>
+      </w:r>
+    </w:p>
+    <w:p>
+      <w:pPr>
+        <w:shd w:fill="F0F0F0" w:val="clear"/>
+        <w:spacing w:after="150" w:before="100"/>
+        <w:ind w:left="360"/>
+      </w:pPr>
+      <w:r>
+        <w:rPr>
+          <w:rFonts w:ascii="Consolas" w:cs="Consolas" w:eastAsia="Consolas" w:hAnsi="Consolas"/>
+          <w:sz w:val="20"/>
+          <w:szCs w:val="20"/>
+        </w:rPr>
+        <w:t xml:space="preserve">df -h /</w:t>
+      </w:r>
+    </w:p>
+    <w:p>
+      <w:pPr>
+        <w:spacing w:after="150"/>
+      </w:pPr>
+      <w:r>
+        <w:t xml:space="preserve">Finally, open the Web Control Portal and confirm your Picotuner IP address, site details and any memory presets have all come across. They should have — the copy is a faithful clone. Work through the verification checklist in Section 9 if you want to be thorough.</w:t>
+      </w:r>
+    </w:p>
+    <w:p>
+      <w:pPr>
+        <w:pStyle w:val="Heading2"/>
+        <w:spacing w:after="150" w:before="300"/>
+      </w:pPr>
+      <w:r>
+        <w:t xml:space="preserve">A.8 Troubleshooting</w:t>
+      </w:r>
+    </w:p>
+    <w:p>
+      <w:pPr>
+        <w:pStyle w:val="Heading3"/>
+        <w:spacing w:after="120" w:before="260"/>
+      </w:pPr>
+      <w:r>
+        <w:t xml:space="preserve">The NVMe drive does not appear in lsblk</w:t>
+      </w:r>
+    </w:p>
+    <w:p>
+      <w:pPr>
+        <w:spacing w:after="150"/>
+      </w:pPr>
+      <w:r>
+        <w:t xml:space="preserve">Shut down, disconnect the power, and reseat both the drive in the HAT and the ribbon cable at the PCIe connector. A cable fitted the wrong way round, or not pushed fully home, accounts for most cases.</w:t>
+      </w:r>
+    </w:p>
+    <w:p>
+      <w:pPr>
+        <w:spacing w:after="150"/>
+      </w:pPr>
+      <w:r>
+        <w:t xml:space="preserve">If it is still missing, explicitly enable the PCIe connector:</w:t>
+      </w:r>
+    </w:p>
+    <w:p>
+      <w:pPr>
+        <w:shd w:fill="F0F0F0" w:val="clear"/>
+        <w:spacing w:after="150" w:before="100"/>
+        <w:ind w:left="360"/>
+      </w:pPr>
+      <w:r>
+        <w:rPr>
+          <w:rFonts w:ascii="Consolas" w:cs="Consolas" w:eastAsia="Consolas" w:hAnsi="Consolas"/>
+          <w:sz w:val="20"/>
+          <w:szCs w:val="20"/>
+        </w:rPr>
+        <w:t xml:space="preserve">sudo nano /boot/firmware/config.txt</w:t>
+      </w:r>
+    </w:p>
+    <w:p>
+      <w:pPr>
+        <w:spacing w:after="150"/>
+      </w:pPr>
+      <w:r>
+        <w:t xml:space="preserve">Add this line at the end, then save with Ctrl+O and exit with Ctrl+X:</w:t>
+      </w:r>
+    </w:p>
+    <w:p>
+      <w:pPr>
+        <w:shd w:fill="F0F0F0" w:val="clear"/>
+        <w:spacing w:after="150" w:before="100"/>
+        <w:ind w:left="360"/>
+      </w:pPr>
+      <w:r>
+        <w:rPr>
+          <w:rFonts w:ascii="Consolas" w:cs="Consolas" w:eastAsia="Consolas" w:hAnsi="Consolas"/>
+          <w:sz w:val="20"/>
+          <w:szCs w:val="20"/>
+        </w:rPr>
+        <w:t xml:space="preserve">dtparam=pciex1</w:t>
+      </w:r>
+    </w:p>
+    <w:p>
+      <w:pPr>
+        <w:spacing w:after="150"/>
+      </w:pPr>
+      <w:r>
+        <w:t xml:space="preserve">Reboot and check lsblk again.</w:t>
+      </w:r>
+    </w:p>
+    <w:p>
+      <w:pPr>
+        <w:pStyle w:val="Heading3"/>
+        <w:spacing w:after="120" w:before="260"/>
+      </w:pPr>
+      <w:r>
+        <w:t xml:space="preserve">It boots to a rainbow screen, or does not boot at all</w:t>
+      </w:r>
+    </w:p>
+    <w:p>
+      <w:pPr>
+        <w:spacing w:after="150"/>
+      </w:pPr>
+      <w:r>
+        <w:t xml:space="preserve">Put the SD card back in. It still contains your working installation, and with the boot order set to try NVMe first and fall back to SD, the Pi will start from the card and let you investigate. Nothing is lost.</w:t>
+      </w:r>
+    </w:p>
+    <w:p>
+      <w:pPr>
+        <w:pStyle w:val="Heading3"/>
+        <w:spacing w:after="120" w:before="260"/>
+      </w:pPr>
+      <w:r>
+        <w:t xml:space="preserve">Everything works, but the drive occasionally drops out</w:t>
+      </w:r>
+    </w:p>
+    <w:p>
+      <w:pPr>
+        <w:spacing w:after="150"/>
+      </w:pPr>
+      <w:r>
+        <w:t xml:space="preserve">This is almost always power. The Pi 5 needs its full 5A supply, or PoE+ rather than standard PoE, once a drive is drawing from it. A drive that works on the bench and misbehaves at a site is worth checking against the site's PoE budget before suspecting the drive itself.</w:t>
+      </w:r>
+    </w:p>
+    <w:p>
+      <w:pPr>
+        <w:pStyle w:val="Heading3"/>
+        <w:spacing w:after="120" w:before="260"/>
+      </w:pPr>
+      <w:r>
+        <w:t xml:space="preserve">Can I run at PCIe Gen 3?</w:t>
+      </w:r>
+    </w:p>
+    <w:p>
+      <w:pPr>
+        <w:spacing w:after="150"/>
+      </w:pPr>
+      <w:r>
+        <w:t xml:space="preserve">You can, by adding dtparam=pciex1_gen=3 to config.txt, but it is outside the Pi 5's certified specification and not all drives are stable at that rate. There is no benefit for Lynx — the default Gen 2 speed is far more than the receiver needs. Leave it alone.</w:t>
+      </w:r>
+    </w:p>
     <w:sectPr>
       <w:pgSz w:w="12240" w:h="15840" w:orient="portrait"/>
       <w:pgMar w:top="1440" w:right="1440" w:bottom="1440" w:left="1440" w:header="708" w:footer="708" w:gutter="0"/>

</xml_diff>